<commit_message>
some new changes apply
</commit_message>
<xml_diff>
--- a/files/Arshad_Ali_Cover_Letter.docx
+++ b/files/Arshad_Ali_Cover_Letter.docx
@@ -164,7 +164,39 @@
           <w:sz w:val="20"/>
           <w:szCs w:val="20"/>
         </w:rPr>
-        <w:t xml:space="preserve"> working with Python Django. Currently, I am employed at Micro Data Tech Solutions (MDTS), where I actively contribute to the development, optimization, and deployment of scalable web applications. </w:t>
+        <w:t xml:space="preserve"> working with Python Django. Currently, I am employed at </w:t>
+      </w:r>
+      <w:r>
+        <w:rPr>
+          <w:rFonts w:asciiTheme="majorBidi" w:hAnsiTheme="majorBidi" w:cstheme="majorBidi"/>
+          <w:sz w:val="20"/>
+          <w:szCs w:val="20"/>
+        </w:rPr>
+        <w:t>Nexa</w:t>
+      </w:r>
+      <w:r>
+        <w:rPr>
+          <w:rFonts w:asciiTheme="majorBidi" w:hAnsiTheme="majorBidi" w:cstheme="majorBidi"/>
+          <w:sz w:val="20"/>
+          <w:szCs w:val="20"/>
+        </w:rPr>
+        <w:t xml:space="preserve"> Tech Solutions (</w:t>
+      </w:r>
+      <w:r>
+        <w:rPr>
+          <w:rFonts w:asciiTheme="majorBidi" w:hAnsiTheme="majorBidi" w:cstheme="majorBidi"/>
+          <w:sz w:val="20"/>
+          <w:szCs w:val="20"/>
+        </w:rPr>
+        <w:t>N</w:t>
+      </w:r>
+      <w:r>
+        <w:rPr>
+          <w:rFonts w:asciiTheme="majorBidi" w:hAnsiTheme="majorBidi" w:cstheme="majorBidi"/>
+          <w:sz w:val="20"/>
+          <w:szCs w:val="20"/>
+        </w:rPr>
+        <w:t xml:space="preserve">TS), where I actively contribute to the development, optimization, and deployment of scalable web applications. </w:t>
       </w:r>
     </w:p>
     <w:p>

</xml_diff>